<commit_message>
Thema-Bericht: Zusatz-Gewerke, optionaler Ersatzteil-Block, Schriftart Calibri
- thema_report.py: laedt die optionalen Zusatz-Gewerke aus
  SchichtbuchThemaGewerk (inkl. Bereich) und stellt im Docx-Kontext
  `zusatz_gewerke` (Liste), `thema_zusatz_gewerke` (Komma-String)
  und `hat_zusatz_gewerke` / `hat_ersatzteile` (Booleans) bereit.
- thema_template.docx: Zeile "Weitere Gewerke" in der Kopftabelle
  (per {%tr if hat_zusatz_gewerke %} nur bei vorhandenen Eintraegen),
  Block "Verwendete Ersatzteile" komplett mit {%p if hat_ersatzteile %}
  umhuellt, Schriftart auf Calibri umgestellt.
- BERICHTE_PLATZHALTER.md: neue Platzhalter (thema_zusatz_gewerke,
  zusatz_gewerke, hat_zusatz_gewerke) dokumentiert inkl. Beispielen.
- scripts/update_thema_template.py: idempotentes Hilfsskript zum
  erneuten Erzeugen/Anpassen des Templates.

Made-with: Cursor
</commit_message>
<xml_diff>
--- a/templates/reports/thema_template.docx
+++ b/templates/reports/thema_template.docx
@@ -8,7 +8,7 @@
           <w:tab w:val="left" w:pos="1080"/>
         </w:tabs>
         <w:rPr>
-          <w:rFonts w:ascii="Arial" w:hAnsi="Arial" w:cs="Arial"/>
+          <w:rFonts w:ascii="Calibri" w:hAnsi="Calibri" w:cs="Calibri"/>
           <w:bCs/>
           <w:sz w:val="36"/>
           <w:szCs w:val="36"/>
@@ -22,7 +22,7 @@
         </w:tabs>
         <w:ind w:left="284"/>
         <w:rPr>
-          <w:rFonts w:ascii="Arial" w:hAnsi="Arial" w:cs="Arial"/>
+          <w:rFonts w:ascii="Calibri" w:hAnsi="Calibri" w:cs="Calibri"/>
           <w:b/>
           <w:sz w:val="36"/>
           <w:szCs w:val="36"/>
@@ -31,7 +31,7 @@
       </w:pPr>
       <w:r>
         <w:rPr>
-          <w:rFonts w:ascii="Arial" w:hAnsi="Arial" w:cs="Arial"/>
+          <w:rFonts w:ascii="Calibri" w:hAnsi="Calibri" w:cs="Calibri"/>
           <w:b/>
           <w:sz w:val="36"/>
           <w:szCs w:val="36"/>
@@ -41,7 +41,7 @@
       </w:r>
       <w:r>
         <w:rPr>
-          <w:rFonts w:ascii="Arial" w:hAnsi="Arial" w:cs="Arial"/>
+          <w:rFonts w:ascii="Calibri" w:hAnsi="Calibri" w:cs="Calibri"/>
           <w:b/>
           <w:sz w:val="36"/>
           <w:szCs w:val="36"/>
@@ -51,7 +51,7 @@
       </w:r>
       <w:r>
         <w:rPr>
-          <w:rFonts w:ascii="Arial" w:hAnsi="Arial" w:cs="Arial"/>
+          <w:rFonts w:ascii="Calibri" w:hAnsi="Calibri" w:cs="Calibri"/>
           <w:b/>
           <w:sz w:val="36"/>
           <w:szCs w:val="36"/>
@@ -61,7 +61,7 @@
       </w:r>
       <w:r>
         <w:rPr>
-          <w:rFonts w:ascii="Arial" w:hAnsi="Arial" w:cs="Arial"/>
+          <w:rFonts w:ascii="Calibri" w:hAnsi="Calibri" w:cs="Calibri"/>
           <w:b/>
           <w:sz w:val="36"/>
           <w:szCs w:val="36"/>
@@ -73,7 +73,7 @@
     <w:p>
       <w:pPr>
         <w:rPr>
-          <w:rFonts w:ascii="Arial" w:hAnsi="Arial" w:cs="Arial"/>
+          <w:rFonts w:ascii="Calibri" w:hAnsi="Calibri" w:cs="Calibri"/>
           <w:sz w:val="22"/>
           <w:szCs w:val="22"/>
         </w:rPr>
@@ -84,7 +84,7 @@
         <w:ind w:left="227"/>
         <w:jc w:val="both"/>
         <w:rPr>
-          <w:rFonts w:ascii="Arial" w:hAnsi="Arial" w:cs="Arial"/>
+          <w:rFonts w:ascii="Calibri" w:hAnsi="Calibri" w:cs="Calibri"/>
           <w:sz w:val="22"/>
           <w:szCs w:val="22"/>
         </w:rPr>
@@ -115,7 +115,7 @@
               <w:spacing w:before="240"/>
               <w:jc w:val="both"/>
               <w:rPr>
-                <w:rFonts w:ascii="Arial" w:hAnsi="Arial" w:cs="Arial"/>
+                <w:rFonts w:ascii="Calibri" w:hAnsi="Calibri" w:cs="Calibri"/>
                 <w:b/>
                 <w:bCs/>
                 <w:sz w:val="28"/>
@@ -124,7 +124,7 @@
             </w:pPr>
             <w:r>
               <w:rPr>
-                <w:rFonts w:ascii="Arial" w:hAnsi="Arial" w:cs="Arial"/>
+                <w:rFonts w:ascii="Calibri" w:hAnsi="Calibri" w:cs="Calibri"/>
                 <w:b/>
                 <w:bCs/>
                 <w:sz w:val="28"/>
@@ -143,14 +143,14 @@
               <w:spacing w:before="240"/>
               <w:jc w:val="both"/>
               <w:rPr>
-                <w:rFonts w:ascii="Arial" w:hAnsi="Arial" w:cs="Arial"/>
+                <w:rFonts w:ascii="Calibri" w:hAnsi="Calibri" w:cs="Calibri"/>
                 <w:sz w:val="28"/>
                 <w:szCs w:val="28"/>
               </w:rPr>
             </w:pPr>
             <w:r>
               <w:rPr>
-                <w:rFonts w:ascii="Arial" w:hAnsi="Arial" w:cs="Arial"/>
+                <w:rFonts w:ascii="Calibri" w:hAnsi="Calibri" w:cs="Calibri"/>
                 <w:sz w:val="28"/>
                 <w:szCs w:val="28"/>
               </w:rPr>
@@ -159,7 +159,7 @@
             <w:proofErr w:type="spellStart"/>
             <w:r>
               <w:rPr>
-                <w:rFonts w:ascii="Arial" w:hAnsi="Arial" w:cs="Arial"/>
+                <w:rFonts w:ascii="Calibri" w:hAnsi="Calibri" w:cs="Calibri"/>
                 <w:sz w:val="28"/>
                 <w:szCs w:val="28"/>
               </w:rPr>
@@ -168,7 +168,7 @@
             <w:proofErr w:type="spellEnd"/>
             <w:r>
               <w:rPr>
-                <w:rFonts w:ascii="Arial" w:hAnsi="Arial" w:cs="Arial"/>
+                <w:rFonts w:ascii="Calibri" w:hAnsi="Calibri" w:cs="Calibri"/>
                 <w:sz w:val="28"/>
                 <w:szCs w:val="28"/>
               </w:rPr>
@@ -191,7 +191,7 @@
               <w:spacing w:before="240"/>
               <w:jc w:val="both"/>
               <w:rPr>
-                <w:rFonts w:ascii="Arial" w:hAnsi="Arial" w:cs="Arial"/>
+                <w:rFonts w:ascii="Calibri" w:hAnsi="Calibri" w:cs="Calibri"/>
                 <w:b/>
                 <w:bCs/>
                 <w:sz w:val="28"/>
@@ -200,7 +200,7 @@
             </w:pPr>
             <w:r>
               <w:rPr>
-                <w:rFonts w:ascii="Arial" w:hAnsi="Arial" w:cs="Arial"/>
+                <w:rFonts w:ascii="Calibri" w:hAnsi="Calibri" w:cs="Calibri"/>
                 <w:b/>
                 <w:bCs/>
                 <w:sz w:val="28"/>
@@ -219,14 +219,14 @@
               <w:spacing w:before="240"/>
               <w:jc w:val="both"/>
               <w:rPr>
-                <w:rFonts w:ascii="Arial" w:hAnsi="Arial" w:cs="Arial"/>
+                <w:rFonts w:ascii="Calibri" w:hAnsi="Calibri" w:cs="Calibri"/>
                 <w:sz w:val="28"/>
                 <w:szCs w:val="28"/>
               </w:rPr>
             </w:pPr>
             <w:r>
               <w:rPr>
-                <w:rFonts w:ascii="Arial" w:hAnsi="Arial" w:cs="Arial"/>
+                <w:rFonts w:ascii="Calibri" w:hAnsi="Calibri" w:cs="Calibri"/>
                 <w:sz w:val="28"/>
                 <w:szCs w:val="28"/>
               </w:rPr>
@@ -235,7 +235,7 @@
             <w:proofErr w:type="spellStart"/>
             <w:r>
               <w:rPr>
-                <w:rFonts w:ascii="Arial" w:hAnsi="Arial" w:cs="Arial"/>
+                <w:rFonts w:ascii="Calibri" w:hAnsi="Calibri" w:cs="Calibri"/>
                 <w:sz w:val="28"/>
                 <w:szCs w:val="28"/>
               </w:rPr>
@@ -244,11 +244,185 @@
             <w:proofErr w:type="spellEnd"/>
             <w:r>
               <w:rPr>
-                <w:rFonts w:ascii="Arial" w:hAnsi="Arial" w:cs="Arial"/>
+                <w:rFonts w:ascii="Calibri" w:hAnsi="Calibri" w:cs="Calibri"/>
                 <w:sz w:val="28"/>
                 <w:szCs w:val="28"/>
               </w:rPr>
               <w:t>}}</w:t>
+            </w:r>
+          </w:p>
+        </w:tc>
+      </w:tr>
+      <w:tr>
+        <w:trPr>
+          <w:trHeight w:val="419"/>
+        </w:trPr>
+        <w:tc>
+          <w:tcPr>
+            <w:tcW w:w="1895" w:type="dxa"/>
+            <w:shd w:val="clear" w:color="auto" w:fill="D9D9D9" w:themeFill="background1" w:themeFillShade="D9"/>
+          </w:tcPr>
+          <w:p>
+            <w:pPr>
+              <w:spacing w:before="240"/>
+              <w:jc w:val="both"/>
+              <w:rPr>
+                <w:rFonts w:ascii="Calibri" w:hAnsi="Calibri" w:cs="Calibri"/>
+                <w:b/>
+                <w:bCs/>
+                <w:sz w:val="28"/>
+                <w:szCs w:val="28"/>
+              </w:rPr>
+            </w:pPr>
+            <w:r>
+              <w:rPr>
+                <w:rFonts w:ascii="Calibri" w:hAnsi="Calibri" w:cs="Calibri"/>
+                <w:b/>
+                <w:bCs/>
+                <w:sz w:val="28"/>
+                <w:szCs w:val="28"/>
+              </w:rPr>
+              <w:t xml:space="preserve">{%tr if hat_zusatz_gewerke %}</w:t>
+            </w:r>
+          </w:p>
+        </w:tc>
+        <w:tc>
+          <w:tcPr>
+            <w:tcW w:w="7087" w:type="dxa"/>
+          </w:tcPr>
+          <w:p>
+            <w:pPr>
+              <w:spacing w:before="240"/>
+              <w:jc w:val="both"/>
+              <w:rPr>
+                <w:rFonts w:ascii="Calibri" w:hAnsi="Calibri" w:cs="Calibri"/>
+                <w:sz w:val="28"/>
+                <w:szCs w:val="28"/>
+              </w:rPr>
+            </w:pPr>
+            <w:r>
+              <w:rPr>
+                <w:rFonts w:ascii="Calibri" w:hAnsi="Calibri" w:cs="Calibri"/>
+                <w:sz w:val="28"/>
+                <w:szCs w:val="28"/>
+              </w:rPr>
+              <w:t xml:space="preserve"/>
+            </w:r>
+          </w:p>
+        </w:tc>
+      </w:tr>
+      <w:tr>
+        <w:trPr>
+          <w:trHeight w:val="419"/>
+        </w:trPr>
+        <w:tc>
+          <w:tcPr>
+            <w:tcW w:w="1895" w:type="dxa"/>
+            <w:shd w:val="clear" w:color="auto" w:fill="D9D9D9" w:themeFill="background1" w:themeFillShade="D9"/>
+          </w:tcPr>
+          <w:p>
+            <w:pPr>
+              <w:spacing w:before="240"/>
+              <w:jc w:val="both"/>
+              <w:rPr>
+                <w:rFonts w:ascii="Calibri" w:hAnsi="Calibri" w:cs="Calibri"/>
+                <w:b/>
+                <w:bCs/>
+                <w:sz w:val="28"/>
+                <w:szCs w:val="28"/>
+              </w:rPr>
+            </w:pPr>
+            <w:r>
+              <w:rPr>
+                <w:rFonts w:ascii="Calibri" w:hAnsi="Calibri" w:cs="Calibri"/>
+                <w:b/>
+                <w:bCs/>
+                <w:sz w:val="28"/>
+                <w:szCs w:val="28"/>
+              </w:rPr>
+              <w:t xml:space="preserve">Weitere Gewerke:</w:t>
+            </w:r>
+          </w:p>
+        </w:tc>
+        <w:tc>
+          <w:tcPr>
+            <w:tcW w:w="7087" w:type="dxa"/>
+          </w:tcPr>
+          <w:p>
+            <w:pPr>
+              <w:spacing w:before="240"/>
+              <w:jc w:val="both"/>
+              <w:rPr>
+                <w:rFonts w:ascii="Calibri" w:hAnsi="Calibri" w:cs="Calibri"/>
+                <w:sz w:val="28"/>
+                <w:szCs w:val="28"/>
+              </w:rPr>
+            </w:pPr>
+            <w:r>
+              <w:rPr>
+                <w:rFonts w:ascii="Calibri" w:hAnsi="Calibri" w:cs="Calibri"/>
+                <w:sz w:val="28"/>
+                <w:szCs w:val="28"/>
+              </w:rPr>
+              <w:t xml:space="preserve">{{thema_zusatz_gewerke}}</w:t>
+            </w:r>
+          </w:p>
+        </w:tc>
+      </w:tr>
+      <w:tr>
+        <w:trPr>
+          <w:trHeight w:val="419"/>
+        </w:trPr>
+        <w:tc>
+          <w:tcPr>
+            <w:tcW w:w="1895" w:type="dxa"/>
+            <w:shd w:val="clear" w:color="auto" w:fill="D9D9D9" w:themeFill="background1" w:themeFillShade="D9"/>
+          </w:tcPr>
+          <w:p>
+            <w:pPr>
+              <w:spacing w:before="240"/>
+              <w:jc w:val="both"/>
+              <w:rPr>
+                <w:rFonts w:ascii="Calibri" w:hAnsi="Calibri" w:cs="Calibri"/>
+                <w:b/>
+                <w:bCs/>
+                <w:sz w:val="28"/>
+                <w:szCs w:val="28"/>
+              </w:rPr>
+            </w:pPr>
+            <w:r>
+              <w:rPr>
+                <w:rFonts w:ascii="Calibri" w:hAnsi="Calibri" w:cs="Calibri"/>
+                <w:b/>
+                <w:bCs/>
+                <w:sz w:val="28"/>
+                <w:szCs w:val="28"/>
+              </w:rPr>
+              <w:t xml:space="preserve">{%tr endif %}</w:t>
+            </w:r>
+          </w:p>
+        </w:tc>
+        <w:tc>
+          <w:tcPr>
+            <w:tcW w:w="7087" w:type="dxa"/>
+          </w:tcPr>
+          <w:p>
+            <w:pPr>
+              <w:spacing w:before="240"/>
+              <w:jc w:val="both"/>
+              <w:rPr>
+                <w:rFonts w:ascii="Calibri" w:hAnsi="Calibri" w:cs="Calibri"/>
+                <w:sz w:val="28"/>
+                <w:szCs w:val="28"/>
+              </w:rPr>
+            </w:pPr>
+            <w:r>
+              <w:rPr>
+                <w:rFonts w:ascii="Calibri" w:hAnsi="Calibri" w:cs="Calibri"/>
+                <w:sz w:val="28"/>
+                <w:szCs w:val="28"/>
+              </w:rPr>
+              <w:t xml:space="preserve"/>
             </w:r>
           </w:p>
         </w:tc>
@@ -267,7 +441,7 @@
               <w:spacing w:before="240"/>
               <w:jc w:val="both"/>
               <w:rPr>
-                <w:rFonts w:ascii="Arial" w:hAnsi="Arial" w:cs="Arial"/>
+                <w:rFonts w:ascii="Calibri" w:hAnsi="Calibri" w:cs="Calibri"/>
                 <w:b/>
                 <w:bCs/>
                 <w:sz w:val="28"/>
@@ -276,7 +450,7 @@
             </w:pPr>
             <w:r>
               <w:rPr>
-                <w:rFonts w:ascii="Arial" w:hAnsi="Arial" w:cs="Arial"/>
+                <w:rFonts w:ascii="Calibri" w:hAnsi="Calibri" w:cs="Calibri"/>
                 <w:b/>
                 <w:bCs/>
                 <w:sz w:val="28"/>
@@ -295,14 +469,14 @@
               <w:spacing w:before="240"/>
               <w:jc w:val="both"/>
               <w:rPr>
-                <w:rFonts w:ascii="Arial" w:hAnsi="Arial" w:cs="Arial"/>
+                <w:rFonts w:ascii="Calibri" w:hAnsi="Calibri" w:cs="Calibri"/>
                 <w:sz w:val="28"/>
                 <w:szCs w:val="28"/>
               </w:rPr>
             </w:pPr>
             <w:r>
               <w:rPr>
-                <w:rFonts w:ascii="Arial" w:hAnsi="Arial" w:cs="Arial"/>
+                <w:rFonts w:ascii="Calibri" w:hAnsi="Calibri" w:cs="Calibri"/>
                 <w:sz w:val="28"/>
                 <w:szCs w:val="28"/>
               </w:rPr>
@@ -311,7 +485,7 @@
             <w:proofErr w:type="spellStart"/>
             <w:r>
               <w:rPr>
-                <w:rFonts w:ascii="Arial" w:hAnsi="Arial" w:cs="Arial"/>
+                <w:rFonts w:ascii="Calibri" w:hAnsi="Calibri" w:cs="Calibri"/>
                 <w:sz w:val="28"/>
                 <w:szCs w:val="28"/>
               </w:rPr>
@@ -320,7 +494,7 @@
             <w:proofErr w:type="spellEnd"/>
             <w:r>
               <w:rPr>
-                <w:rFonts w:ascii="Arial" w:hAnsi="Arial" w:cs="Arial"/>
+                <w:rFonts w:ascii="Calibri" w:hAnsi="Calibri" w:cs="Calibri"/>
                 <w:sz w:val="28"/>
                 <w:szCs w:val="28"/>
               </w:rPr>
@@ -343,7 +517,7 @@
               <w:spacing w:before="240"/>
               <w:jc w:val="both"/>
               <w:rPr>
-                <w:rFonts w:ascii="Arial" w:hAnsi="Arial" w:cs="Arial"/>
+                <w:rFonts w:ascii="Calibri" w:hAnsi="Calibri" w:cs="Calibri"/>
                 <w:b/>
                 <w:bCs/>
                 <w:sz w:val="28"/>
@@ -352,7 +526,7 @@
             </w:pPr>
             <w:r>
               <w:rPr>
-                <w:rFonts w:ascii="Arial" w:hAnsi="Arial" w:cs="Arial"/>
+                <w:rFonts w:ascii="Calibri" w:hAnsi="Calibri" w:cs="Calibri"/>
                 <w:b/>
                 <w:bCs/>
                 <w:sz w:val="28"/>
@@ -371,14 +545,14 @@
               <w:spacing w:before="240"/>
               <w:jc w:val="both"/>
               <w:rPr>
-                <w:rFonts w:ascii="Arial" w:hAnsi="Arial" w:cs="Arial"/>
+                <w:rFonts w:ascii="Calibri" w:hAnsi="Calibri" w:cs="Calibri"/>
                 <w:sz w:val="28"/>
                 <w:szCs w:val="28"/>
               </w:rPr>
             </w:pPr>
             <w:r>
               <w:rPr>
-                <w:rFonts w:ascii="Arial" w:hAnsi="Arial" w:cs="Arial"/>
+                <w:rFonts w:ascii="Calibri" w:hAnsi="Calibri" w:cs="Calibri"/>
                 <w:sz w:val="28"/>
                 <w:szCs w:val="28"/>
               </w:rPr>
@@ -387,7 +561,7 @@
             <w:proofErr w:type="spellStart"/>
             <w:r>
               <w:rPr>
-                <w:rFonts w:ascii="Arial" w:hAnsi="Arial" w:cs="Arial"/>
+                <w:rFonts w:ascii="Calibri" w:hAnsi="Calibri" w:cs="Calibri"/>
                 <w:sz w:val="28"/>
                 <w:szCs w:val="28"/>
               </w:rPr>
@@ -396,7 +570,7 @@
             <w:proofErr w:type="spellEnd"/>
             <w:r>
               <w:rPr>
-                <w:rFonts w:ascii="Arial" w:hAnsi="Arial" w:cs="Arial"/>
+                <w:rFonts w:ascii="Calibri" w:hAnsi="Calibri" w:cs="Calibri"/>
                 <w:sz w:val="28"/>
                 <w:szCs w:val="28"/>
               </w:rPr>
@@ -411,7 +585,7 @@
         <w:ind w:left="227"/>
         <w:jc w:val="both"/>
         <w:rPr>
-          <w:rFonts w:ascii="Arial" w:hAnsi="Arial" w:cs="Arial"/>
+          <w:rFonts w:ascii="Calibri" w:hAnsi="Calibri" w:cs="Calibri"/>
           <w:sz w:val="22"/>
           <w:szCs w:val="22"/>
         </w:rPr>
@@ -422,7 +596,7 @@
         <w:ind w:left="227"/>
         <w:jc w:val="both"/>
         <w:rPr>
-          <w:rFonts w:ascii="Arial" w:hAnsi="Arial" w:cs="Arial"/>
+          <w:rFonts w:ascii="Calibri" w:hAnsi="Calibri" w:cs="Calibri"/>
           <w:sz w:val="22"/>
           <w:szCs w:val="22"/>
         </w:rPr>
@@ -433,7 +607,7 @@
         <w:ind w:left="227"/>
         <w:jc w:val="both"/>
         <w:rPr>
-          <w:rFonts w:ascii="Arial" w:hAnsi="Arial" w:cs="Arial"/>
+          <w:rFonts w:ascii="Calibri" w:hAnsi="Calibri" w:cs="Calibri"/>
           <w:sz w:val="22"/>
           <w:szCs w:val="22"/>
         </w:rPr>
@@ -444,7 +618,7 @@
         <w:ind w:left="284"/>
         <w:jc w:val="both"/>
         <w:rPr>
-          <w:rFonts w:ascii="Arial" w:hAnsi="Arial" w:cs="Arial"/>
+          <w:rFonts w:ascii="Calibri" w:hAnsi="Calibri" w:cs="Calibri"/>
           <w:b/>
           <w:bCs/>
           <w:sz w:val="28"/>
@@ -453,7 +627,7 @@
       </w:pPr>
       <w:r>
         <w:rPr>
-          <w:rFonts w:ascii="Arial" w:hAnsi="Arial" w:cs="Arial"/>
+          <w:rFonts w:ascii="Calibri" w:hAnsi="Calibri" w:cs="Calibri"/>
           <w:b/>
           <w:bCs/>
           <w:sz w:val="28"/>
@@ -467,7 +641,7 @@
         <w:ind w:left="284"/>
         <w:jc w:val="both"/>
         <w:rPr>
-          <w:rFonts w:ascii="Arial" w:hAnsi="Arial" w:cs="Arial"/>
+          <w:rFonts w:ascii="Calibri" w:hAnsi="Calibri" w:cs="Calibri"/>
           <w:b/>
           <w:bCs/>
           <w:sz w:val="16"/>
@@ -480,14 +654,14 @@
         <w:ind w:left="284"/>
         <w:jc w:val="both"/>
         <w:rPr>
-          <w:rFonts w:ascii="Arial" w:hAnsi="Arial" w:cs="Arial"/>
-          <w:sz w:val="22"/>
-          <w:szCs w:val="22"/>
-        </w:rPr>
-      </w:pPr>
-      <w:r>
-        <w:rPr>
-          <w:rFonts w:ascii="Arial" w:hAnsi="Arial" w:cs="Arial"/>
+          <w:rFonts w:ascii="Calibri" w:hAnsi="Calibri" w:cs="Calibri"/>
+          <w:sz w:val="22"/>
+          <w:szCs w:val="22"/>
+        </w:rPr>
+      </w:pPr>
+      <w:r>
+        <w:rPr>
+          <w:rFonts w:ascii="Calibri" w:hAnsi="Calibri" w:cs="Calibri"/>
           <w:sz w:val="22"/>
           <w:szCs w:val="22"/>
         </w:rPr>
@@ -496,7 +670,7 @@
       <w:proofErr w:type="spellStart"/>
       <w:r>
         <w:rPr>
-          <w:rFonts w:ascii="Arial" w:hAnsi="Arial" w:cs="Arial"/>
+          <w:rFonts w:ascii="Calibri" w:hAnsi="Calibri" w:cs="Calibri"/>
           <w:sz w:val="22"/>
           <w:szCs w:val="22"/>
         </w:rPr>
@@ -505,7 +679,7 @@
       <w:proofErr w:type="spellEnd"/>
       <w:r>
         <w:rPr>
-          <w:rFonts w:ascii="Arial" w:hAnsi="Arial" w:cs="Arial"/>
+          <w:rFonts w:ascii="Calibri" w:hAnsi="Calibri" w:cs="Calibri"/>
           <w:sz w:val="22"/>
           <w:szCs w:val="22"/>
         </w:rPr>
@@ -514,7 +688,7 @@
       <w:proofErr w:type="spellStart"/>
       <w:r>
         <w:rPr>
-          <w:rFonts w:ascii="Arial" w:hAnsi="Arial" w:cs="Arial"/>
+          <w:rFonts w:ascii="Calibri" w:hAnsi="Calibri" w:cs="Calibri"/>
           <w:sz w:val="22"/>
           <w:szCs w:val="22"/>
         </w:rPr>
@@ -522,7 +696,7 @@
       </w:r>
       <w:r>
         <w:rPr>
-          <w:rFonts w:ascii="Arial" w:hAnsi="Arial" w:cs="Arial"/>
+          <w:rFonts w:ascii="Calibri" w:hAnsi="Calibri" w:cs="Calibri"/>
           <w:sz w:val="22"/>
           <w:szCs w:val="22"/>
         </w:rPr>
@@ -531,7 +705,7 @@
       <w:proofErr w:type="spellEnd"/>
       <w:r>
         <w:rPr>
-          <w:rFonts w:ascii="Arial" w:hAnsi="Arial" w:cs="Arial"/>
+          <w:rFonts w:ascii="Calibri" w:hAnsi="Calibri" w:cs="Calibri"/>
           <w:sz w:val="22"/>
           <w:szCs w:val="22"/>
         </w:rPr>
@@ -540,7 +714,7 @@
       <w:proofErr w:type="spellStart"/>
       <w:r>
         <w:rPr>
-          <w:rFonts w:ascii="Arial" w:hAnsi="Arial" w:cs="Arial"/>
+          <w:rFonts w:ascii="Calibri" w:hAnsi="Calibri" w:cs="Calibri"/>
           <w:sz w:val="22"/>
           <w:szCs w:val="22"/>
         </w:rPr>
@@ -549,7 +723,7 @@
       <w:proofErr w:type="spellEnd"/>
       <w:r>
         <w:rPr>
-          <w:rFonts w:ascii="Arial" w:hAnsi="Arial" w:cs="Arial"/>
+          <w:rFonts w:ascii="Calibri" w:hAnsi="Calibri" w:cs="Calibri"/>
           <w:sz w:val="22"/>
           <w:szCs w:val="22"/>
         </w:rPr>
@@ -561,14 +735,14 @@
         <w:ind w:left="284"/>
         <w:jc w:val="both"/>
         <w:rPr>
-          <w:rFonts w:ascii="Arial" w:hAnsi="Arial" w:cs="Arial"/>
-          <w:sz w:val="22"/>
-          <w:szCs w:val="22"/>
-        </w:rPr>
-      </w:pPr>
-      <w:r>
-        <w:rPr>
-          <w:rFonts w:ascii="Arial" w:hAnsi="Arial" w:cs="Arial"/>
+          <w:rFonts w:ascii="Calibri" w:hAnsi="Calibri" w:cs="Calibri"/>
+          <w:sz w:val="22"/>
+          <w:szCs w:val="22"/>
+        </w:rPr>
+      </w:pPr>
+      <w:r>
+        <w:rPr>
+          <w:rFonts w:ascii="Calibri" w:hAnsi="Calibri" w:cs="Calibri"/>
           <w:sz w:val="22"/>
           <w:szCs w:val="22"/>
         </w:rPr>
@@ -578,7 +752,7 @@
       <w:proofErr w:type="gramStart"/>
       <w:r>
         <w:rPr>
-          <w:rFonts w:ascii="Arial" w:hAnsi="Arial" w:cs="Arial"/>
+          <w:rFonts w:ascii="Calibri" w:hAnsi="Calibri" w:cs="Calibri"/>
           <w:sz w:val="22"/>
           <w:szCs w:val="22"/>
         </w:rPr>
@@ -586,7 +760,7 @@
       </w:r>
       <w:r>
         <w:rPr>
-          <w:rFonts w:ascii="Arial" w:hAnsi="Arial" w:cs="Arial"/>
+          <w:rFonts w:ascii="Calibri" w:hAnsi="Calibri" w:cs="Calibri"/>
           <w:sz w:val="22"/>
           <w:szCs w:val="22"/>
         </w:rPr>
@@ -595,7 +769,7 @@
       <w:proofErr w:type="gramEnd"/>
       <w:r>
         <w:rPr>
-          <w:rFonts w:ascii="Arial" w:hAnsi="Arial" w:cs="Arial"/>
+          <w:rFonts w:ascii="Calibri" w:hAnsi="Calibri" w:cs="Calibri"/>
           <w:sz w:val="22"/>
           <w:szCs w:val="22"/>
         </w:rPr>
@@ -604,7 +778,7 @@
       <w:proofErr w:type="spellEnd"/>
       <w:r>
         <w:rPr>
-          <w:rFonts w:ascii="Arial" w:hAnsi="Arial" w:cs="Arial"/>
+          <w:rFonts w:ascii="Calibri" w:hAnsi="Calibri" w:cs="Calibri"/>
           <w:sz w:val="22"/>
           <w:szCs w:val="22"/>
         </w:rPr>
@@ -612,7 +786,7 @@
       </w:r>
       <w:r>
         <w:rPr>
-          <w:rFonts w:ascii="Arial" w:hAnsi="Arial" w:cs="Arial"/>
+          <w:rFonts w:ascii="Calibri" w:hAnsi="Calibri" w:cs="Calibri"/>
           <w:sz w:val="22"/>
           <w:szCs w:val="22"/>
         </w:rPr>
@@ -620,7 +794,7 @@
       </w:r>
       <w:r>
         <w:rPr>
-          <w:rFonts w:ascii="Arial" w:hAnsi="Arial" w:cs="Arial"/>
+          <w:rFonts w:ascii="Calibri" w:hAnsi="Calibri" w:cs="Calibri"/>
           <w:sz w:val="22"/>
           <w:szCs w:val="22"/>
         </w:rPr>
@@ -630,7 +804,7 @@
       <w:proofErr w:type="gramStart"/>
       <w:r>
         <w:rPr>
-          <w:rFonts w:ascii="Arial" w:hAnsi="Arial" w:cs="Arial"/>
+          <w:rFonts w:ascii="Calibri" w:hAnsi="Calibri" w:cs="Calibri"/>
           <w:sz w:val="22"/>
           <w:szCs w:val="22"/>
         </w:rPr>
@@ -638,7 +812,7 @@
       </w:r>
       <w:r>
         <w:rPr>
-          <w:rFonts w:ascii="Arial" w:hAnsi="Arial" w:cs="Arial"/>
+          <w:rFonts w:ascii="Calibri" w:hAnsi="Calibri" w:cs="Calibri"/>
           <w:sz w:val="22"/>
           <w:szCs w:val="22"/>
         </w:rPr>
@@ -647,7 +821,7 @@
       <w:proofErr w:type="gramEnd"/>
       <w:r>
         <w:rPr>
-          <w:rFonts w:ascii="Arial" w:hAnsi="Arial" w:cs="Arial"/>
+          <w:rFonts w:ascii="Calibri" w:hAnsi="Calibri" w:cs="Calibri"/>
           <w:sz w:val="22"/>
           <w:szCs w:val="22"/>
         </w:rPr>
@@ -656,7 +830,7 @@
       <w:proofErr w:type="spellEnd"/>
       <w:r>
         <w:rPr>
-          <w:rFonts w:ascii="Arial" w:hAnsi="Arial" w:cs="Arial"/>
+          <w:rFonts w:ascii="Calibri" w:hAnsi="Calibri" w:cs="Calibri"/>
           <w:sz w:val="22"/>
           <w:szCs w:val="22"/>
         </w:rPr>
@@ -664,7 +838,7 @@
       </w:r>
       <w:r>
         <w:rPr>
-          <w:rFonts w:ascii="Arial" w:hAnsi="Arial" w:cs="Arial"/>
+          <w:rFonts w:ascii="Calibri" w:hAnsi="Calibri" w:cs="Calibri"/>
           <w:sz w:val="22"/>
           <w:szCs w:val="22"/>
         </w:rPr>
@@ -672,7 +846,7 @@
       </w:r>
       <w:r>
         <w:rPr>
-          <w:rFonts w:ascii="Arial" w:hAnsi="Arial" w:cs="Arial"/>
+          <w:rFonts w:ascii="Calibri" w:hAnsi="Calibri" w:cs="Calibri"/>
           <w:sz w:val="22"/>
           <w:szCs w:val="22"/>
         </w:rPr>
@@ -682,7 +856,7 @@
       <w:proofErr w:type="gramStart"/>
       <w:r>
         <w:rPr>
-          <w:rFonts w:ascii="Arial" w:hAnsi="Arial" w:cs="Arial"/>
+          <w:rFonts w:ascii="Calibri" w:hAnsi="Calibri" w:cs="Calibri"/>
           <w:sz w:val="22"/>
           <w:szCs w:val="22"/>
         </w:rPr>
@@ -692,7 +866,7 @@
       <w:proofErr w:type="gramEnd"/>
       <w:r>
         <w:rPr>
-          <w:rFonts w:ascii="Arial" w:hAnsi="Arial" w:cs="Arial"/>
+          <w:rFonts w:ascii="Calibri" w:hAnsi="Calibri" w:cs="Calibri"/>
           <w:sz w:val="22"/>
           <w:szCs w:val="22"/>
         </w:rPr>
@@ -704,7 +878,7 @@
         <w:ind w:left="284"/>
         <w:jc w:val="both"/>
         <w:rPr>
-          <w:rFonts w:ascii="Arial" w:hAnsi="Arial" w:cs="Arial"/>
+          <w:rFonts w:ascii="Calibri" w:hAnsi="Calibri" w:cs="Calibri"/>
           <w:sz w:val="12"/>
           <w:szCs w:val="12"/>
         </w:rPr>
@@ -714,14 +888,14 @@
       <w:pPr>
         <w:ind w:left="284" w:right="708"/>
         <w:rPr>
-          <w:rFonts w:ascii="Arial" w:hAnsi="Arial" w:cs="Arial"/>
-          <w:sz w:val="22"/>
-          <w:szCs w:val="22"/>
-        </w:rPr>
-      </w:pPr>
-      <w:r>
-        <w:rPr>
-          <w:rFonts w:ascii="Arial" w:hAnsi="Arial" w:cs="Arial"/>
+          <w:rFonts w:ascii="Calibri" w:hAnsi="Calibri" w:cs="Calibri"/>
+          <w:sz w:val="22"/>
+          <w:szCs w:val="22"/>
+        </w:rPr>
+      </w:pPr>
+      <w:r>
+        <w:rPr>
+          <w:rFonts w:ascii="Calibri" w:hAnsi="Calibri" w:cs="Calibri"/>
           <w:sz w:val="22"/>
           <w:szCs w:val="22"/>
         </w:rPr>
@@ -731,7 +905,7 @@
       <w:proofErr w:type="gramStart"/>
       <w:r>
         <w:rPr>
-          <w:rFonts w:ascii="Arial" w:hAnsi="Arial" w:cs="Arial"/>
+          <w:rFonts w:ascii="Calibri" w:hAnsi="Calibri" w:cs="Calibri"/>
           <w:sz w:val="22"/>
           <w:szCs w:val="22"/>
         </w:rPr>
@@ -739,7 +913,7 @@
       </w:r>
       <w:r>
         <w:rPr>
-          <w:rFonts w:ascii="Arial" w:hAnsi="Arial" w:cs="Arial"/>
+          <w:rFonts w:ascii="Calibri" w:hAnsi="Calibri" w:cs="Calibri"/>
           <w:sz w:val="22"/>
           <w:szCs w:val="22"/>
         </w:rPr>
@@ -749,7 +923,7 @@
       <w:proofErr w:type="gramEnd"/>
       <w:r>
         <w:rPr>
-          <w:rFonts w:ascii="Arial" w:hAnsi="Arial" w:cs="Arial"/>
+          <w:rFonts w:ascii="Calibri" w:hAnsi="Calibri" w:cs="Calibri"/>
           <w:sz w:val="22"/>
           <w:szCs w:val="22"/>
         </w:rPr>
@@ -761,14 +935,14 @@
         <w:ind w:left="284"/>
         <w:jc w:val="both"/>
         <w:rPr>
-          <w:rFonts w:ascii="Arial" w:hAnsi="Arial" w:cs="Arial"/>
-          <w:sz w:val="22"/>
-          <w:szCs w:val="22"/>
-        </w:rPr>
-      </w:pPr>
-      <w:r>
-        <w:rPr>
-          <w:rFonts w:ascii="Arial" w:hAnsi="Arial" w:cs="Arial"/>
+          <w:rFonts w:ascii="Calibri" w:hAnsi="Calibri" w:cs="Calibri"/>
+          <w:sz w:val="22"/>
+          <w:szCs w:val="22"/>
+        </w:rPr>
+      </w:pPr>
+      <w:r>
+        <w:rPr>
+          <w:rFonts w:ascii="Calibri" w:hAnsi="Calibri" w:cs="Calibri"/>
           <w:noProof/>
           <w:color w:val="000000" w:themeColor="text1"/>
           <w:sz w:val="22"/>
@@ -849,14 +1023,14 @@
         <w:ind w:left="284"/>
         <w:jc w:val="both"/>
         <w:rPr>
-          <w:rFonts w:ascii="Arial" w:hAnsi="Arial" w:cs="Arial"/>
-          <w:sz w:val="22"/>
-          <w:szCs w:val="22"/>
-        </w:rPr>
-      </w:pPr>
-      <w:r>
-        <w:rPr>
-          <w:rFonts w:ascii="Arial" w:hAnsi="Arial" w:cs="Arial"/>
+          <w:rFonts w:ascii="Calibri" w:hAnsi="Calibri" w:cs="Calibri"/>
+          <w:sz w:val="22"/>
+          <w:szCs w:val="22"/>
+        </w:rPr>
+      </w:pPr>
+      <w:r>
+        <w:rPr>
+          <w:rFonts w:ascii="Calibri" w:hAnsi="Calibri" w:cs="Calibri"/>
           <w:sz w:val="22"/>
           <w:szCs w:val="22"/>
         </w:rPr>
@@ -864,7 +1038,7 @@
       </w:r>
       <w:r>
         <w:rPr>
-          <w:rFonts w:ascii="Arial" w:hAnsi="Arial" w:cs="Arial"/>
+          <w:rFonts w:ascii="Calibri" w:hAnsi="Calibri" w:cs="Calibri"/>
           <w:sz w:val="22"/>
           <w:szCs w:val="22"/>
         </w:rPr>
@@ -873,7 +1047,7 @@
       <w:proofErr w:type="spellStart"/>
       <w:r>
         <w:rPr>
-          <w:rFonts w:ascii="Arial" w:hAnsi="Arial" w:cs="Arial"/>
+          <w:rFonts w:ascii="Calibri" w:hAnsi="Calibri" w:cs="Calibri"/>
           <w:sz w:val="22"/>
           <w:szCs w:val="22"/>
         </w:rPr>
@@ -882,7 +1056,7 @@
       <w:proofErr w:type="spellEnd"/>
       <w:r>
         <w:rPr>
-          <w:rFonts w:ascii="Arial" w:hAnsi="Arial" w:cs="Arial"/>
+          <w:rFonts w:ascii="Calibri" w:hAnsi="Calibri" w:cs="Calibri"/>
           <w:sz w:val="22"/>
           <w:szCs w:val="22"/>
         </w:rPr>
@@ -894,7 +1068,7 @@
         <w:ind w:left="284"/>
         <w:jc w:val="both"/>
         <w:rPr>
-          <w:rFonts w:ascii="Arial" w:hAnsi="Arial" w:cs="Arial"/>
+          <w:rFonts w:ascii="Calibri" w:hAnsi="Calibri" w:cs="Calibri"/>
           <w:sz w:val="22"/>
           <w:szCs w:val="22"/>
         </w:rPr>
@@ -905,11 +1079,25 @@
         <w:ind w:left="284"/>
         <w:jc w:val="both"/>
         <w:rPr>
-          <w:rFonts w:ascii="Arial" w:hAnsi="Arial" w:cs="Arial"/>
-          <w:sz w:val="22"/>
-          <w:szCs w:val="22"/>
-        </w:rPr>
-      </w:pPr>
+          <w:rFonts w:ascii="Calibri" w:hAnsi="Calibri" w:cs="Calibri"/>
+          <w:sz w:val="22"/>
+          <w:szCs w:val="22"/>
+        </w:rPr>
+      </w:pPr>
+    </w:p>
+    <w:p>
+      <w:pPr>
+        <w:ind w:left="284"/>
+        <w:jc w:val="both"/>
+      </w:pPr>
+      <w:r>
+        <w:rPr>
+          <w:rFonts w:ascii="Calibri" w:hAnsi="Calibri" w:cs="Calibri"/>
+          <w:sz w:val="22"/>
+          <w:szCs w:val="22"/>
+        </w:rPr>
+        <w:t xml:space="preserve">{%p if hat_ersatzteile %}</w:t>
+      </w:r>
     </w:p>
     <w:p>
       <w:pPr>
@@ -917,7 +1105,7 @@
         <w:ind w:left="284"/>
         <w:jc w:val="both"/>
         <w:rPr>
-          <w:rFonts w:ascii="Arial" w:hAnsi="Arial" w:cs="Arial"/>
+          <w:rFonts w:ascii="Calibri" w:hAnsi="Calibri" w:cs="Calibri"/>
           <w:b/>
           <w:bCs/>
           <w:sz w:val="28"/>
@@ -926,7 +1114,7 @@
       </w:pPr>
       <w:r>
         <w:rPr>
-          <w:rFonts w:ascii="Arial" w:hAnsi="Arial" w:cs="Arial"/>
+          <w:rFonts w:ascii="Calibri" w:hAnsi="Calibri" w:cs="Calibri"/>
           <w:b/>
           <w:bCs/>
           <w:sz w:val="28"/>
@@ -936,7 +1124,7 @@
       </w:r>
       <w:r>
         <w:rPr>
-          <w:rFonts w:ascii="Arial" w:hAnsi="Arial" w:cs="Arial"/>
+          <w:rFonts w:ascii="Calibri" w:hAnsi="Calibri" w:cs="Calibri"/>
           <w:b/>
           <w:bCs/>
           <w:sz w:val="28"/>
@@ -951,7 +1139,7 @@
         <w:ind w:left="284"/>
         <w:jc w:val="both"/>
         <w:rPr>
-          <w:rFonts w:ascii="Arial" w:hAnsi="Arial" w:cs="Arial"/>
+          <w:rFonts w:ascii="Calibri" w:hAnsi="Calibri" w:cs="Calibri"/>
           <w:b/>
           <w:bCs/>
           <w:sz w:val="16"/>
@@ -984,14 +1172,14 @@
               <w:keepLines/>
               <w:jc w:val="center"/>
               <w:rPr>
-                <w:rFonts w:ascii="Arial" w:hAnsi="Arial" w:cs="Arial"/>
+                <w:rFonts w:ascii="Calibri" w:hAnsi="Calibri" w:cs="Calibri"/>
                 <w:sz w:val="22"/>
                 <w:szCs w:val="22"/>
               </w:rPr>
             </w:pPr>
             <w:r>
               <w:rPr>
-                <w:rFonts w:ascii="Arial" w:hAnsi="Arial" w:cs="Arial"/>
+                <w:rFonts w:ascii="Calibri" w:hAnsi="Calibri" w:cs="Calibri"/>
                 <w:sz w:val="22"/>
                 <w:szCs w:val="22"/>
               </w:rPr>
@@ -1009,14 +1197,14 @@
               <w:keepLines/>
               <w:jc w:val="center"/>
               <w:rPr>
-                <w:rFonts w:ascii="Arial" w:hAnsi="Arial" w:cs="Arial"/>
+                <w:rFonts w:ascii="Calibri" w:hAnsi="Calibri" w:cs="Calibri"/>
                 <w:sz w:val="22"/>
                 <w:szCs w:val="22"/>
               </w:rPr>
             </w:pPr>
             <w:r>
               <w:rPr>
-                <w:rFonts w:ascii="Arial" w:hAnsi="Arial" w:cs="Arial"/>
+                <w:rFonts w:ascii="Calibri" w:hAnsi="Calibri" w:cs="Calibri"/>
                 <w:sz w:val="22"/>
                 <w:szCs w:val="22"/>
               </w:rPr>
@@ -1034,14 +1222,14 @@
               <w:keepLines/>
               <w:jc w:val="center"/>
               <w:rPr>
-                <w:rFonts w:ascii="Arial" w:hAnsi="Arial" w:cs="Arial"/>
+                <w:rFonts w:ascii="Calibri" w:hAnsi="Calibri" w:cs="Calibri"/>
                 <w:sz w:val="22"/>
                 <w:szCs w:val="22"/>
               </w:rPr>
             </w:pPr>
             <w:r>
               <w:rPr>
-                <w:rFonts w:ascii="Arial" w:hAnsi="Arial" w:cs="Arial"/>
+                <w:rFonts w:ascii="Calibri" w:hAnsi="Calibri" w:cs="Calibri"/>
                 <w:sz w:val="22"/>
                 <w:szCs w:val="22"/>
               </w:rPr>
@@ -1059,14 +1247,14 @@
               <w:keepLines/>
               <w:jc w:val="center"/>
               <w:rPr>
-                <w:rFonts w:ascii="Arial" w:hAnsi="Arial" w:cs="Arial"/>
+                <w:rFonts w:ascii="Calibri" w:hAnsi="Calibri" w:cs="Calibri"/>
                 <w:sz w:val="22"/>
                 <w:szCs w:val="22"/>
               </w:rPr>
             </w:pPr>
             <w:r>
               <w:rPr>
-                <w:rFonts w:ascii="Arial" w:hAnsi="Arial" w:cs="Arial"/>
+                <w:rFonts w:ascii="Calibri" w:hAnsi="Calibri" w:cs="Calibri"/>
                 <w:sz w:val="22"/>
                 <w:szCs w:val="22"/>
               </w:rPr>
@@ -1081,14 +1269,14 @@
         <w:keepLines/>
         <w:jc w:val="both"/>
         <w:rPr>
-          <w:rFonts w:ascii="Arial" w:hAnsi="Arial" w:cs="Arial"/>
-          <w:sz w:val="22"/>
-          <w:szCs w:val="22"/>
-        </w:rPr>
-      </w:pPr>
-      <w:r>
-        <w:rPr>
-          <w:rFonts w:ascii="Arial" w:hAnsi="Arial" w:cs="Arial"/>
+          <w:rFonts w:ascii="Calibri" w:hAnsi="Calibri" w:cs="Calibri"/>
+          <w:sz w:val="22"/>
+          <w:szCs w:val="22"/>
+        </w:rPr>
+      </w:pPr>
+      <w:r>
+        <w:rPr>
+          <w:rFonts w:ascii="Calibri" w:hAnsi="Calibri" w:cs="Calibri"/>
           <w:sz w:val="22"/>
           <w:szCs w:val="22"/>
         </w:rPr>
@@ -1097,7 +1285,7 @@
       <w:proofErr w:type="spellStart"/>
       <w:r>
         <w:rPr>
-          <w:rFonts w:ascii="Arial" w:hAnsi="Arial" w:cs="Arial"/>
+          <w:rFonts w:ascii="Calibri" w:hAnsi="Calibri" w:cs="Calibri"/>
           <w:sz w:val="22"/>
           <w:szCs w:val="22"/>
         </w:rPr>
@@ -1106,7 +1294,7 @@
       <w:proofErr w:type="spellEnd"/>
       <w:r>
         <w:rPr>
-          <w:rFonts w:ascii="Arial" w:hAnsi="Arial" w:cs="Arial"/>
+          <w:rFonts w:ascii="Calibri" w:hAnsi="Calibri" w:cs="Calibri"/>
           <w:sz w:val="22"/>
           <w:szCs w:val="22"/>
         </w:rPr>
@@ -1115,7 +1303,7 @@
       <w:proofErr w:type="spellStart"/>
       <w:r>
         <w:rPr>
-          <w:rFonts w:ascii="Arial" w:hAnsi="Arial" w:cs="Arial"/>
+          <w:rFonts w:ascii="Calibri" w:hAnsi="Calibri" w:cs="Calibri"/>
           <w:sz w:val="22"/>
           <w:szCs w:val="22"/>
         </w:rPr>
@@ -1124,7 +1312,7 @@
       <w:proofErr w:type="spellEnd"/>
       <w:r>
         <w:rPr>
-          <w:rFonts w:ascii="Arial" w:hAnsi="Arial" w:cs="Arial"/>
+          <w:rFonts w:ascii="Calibri" w:hAnsi="Calibri" w:cs="Calibri"/>
           <w:sz w:val="22"/>
           <w:szCs w:val="22"/>
         </w:rPr>
@@ -1133,7 +1321,7 @@
       <w:proofErr w:type="spellStart"/>
       <w:r>
         <w:rPr>
-          <w:rFonts w:ascii="Arial" w:hAnsi="Arial" w:cs="Arial"/>
+          <w:rFonts w:ascii="Calibri" w:hAnsi="Calibri" w:cs="Calibri"/>
           <w:sz w:val="22"/>
           <w:szCs w:val="22"/>
         </w:rPr>
@@ -1142,7 +1330,7 @@
       <w:proofErr w:type="spellEnd"/>
       <w:r>
         <w:rPr>
-          <w:rFonts w:ascii="Arial" w:hAnsi="Arial" w:cs="Arial"/>
+          <w:rFonts w:ascii="Calibri" w:hAnsi="Calibri" w:cs="Calibri"/>
           <w:sz w:val="22"/>
           <w:szCs w:val="22"/>
         </w:rPr>
@@ -1176,14 +1364,14 @@
               <w:keepLines/>
               <w:jc w:val="center"/>
               <w:rPr>
-                <w:rFonts w:ascii="Arial" w:hAnsi="Arial" w:cs="Arial"/>
+                <w:rFonts w:ascii="Calibri" w:hAnsi="Calibri" w:cs="Calibri"/>
                 <w:sz w:val="20"/>
                 <w:szCs w:val="20"/>
               </w:rPr>
             </w:pPr>
             <w:r>
               <w:rPr>
-                <w:rFonts w:ascii="Arial" w:hAnsi="Arial" w:cs="Arial"/>
+                <w:rFonts w:ascii="Calibri" w:hAnsi="Calibri" w:cs="Calibri"/>
                 <w:sz w:val="20"/>
                 <w:szCs w:val="20"/>
               </w:rPr>
@@ -1193,7 +1381,7 @@
             <w:proofErr w:type="gramStart"/>
             <w:r>
               <w:rPr>
-                <w:rFonts w:ascii="Arial" w:hAnsi="Arial" w:cs="Arial"/>
+                <w:rFonts w:ascii="Calibri" w:hAnsi="Calibri" w:cs="Calibri"/>
                 <w:sz w:val="20"/>
                 <w:szCs w:val="20"/>
               </w:rPr>
@@ -1202,7 +1390,7 @@
             <w:proofErr w:type="gramEnd"/>
             <w:r>
               <w:rPr>
-                <w:rFonts w:ascii="Arial" w:hAnsi="Arial" w:cs="Arial"/>
+                <w:rFonts w:ascii="Calibri" w:hAnsi="Calibri" w:cs="Calibri"/>
                 <w:sz w:val="20"/>
                 <w:szCs w:val="20"/>
               </w:rPr>
@@ -1211,7 +1399,7 @@
             <w:proofErr w:type="spellEnd"/>
             <w:r>
               <w:rPr>
-                <w:rFonts w:ascii="Arial" w:hAnsi="Arial" w:cs="Arial"/>
+                <w:rFonts w:ascii="Calibri" w:hAnsi="Calibri" w:cs="Calibri"/>
                 <w:sz w:val="20"/>
                 <w:szCs w:val="20"/>
               </w:rPr>
@@ -1228,14 +1416,14 @@
               <w:keepLines/>
               <w:jc w:val="both"/>
               <w:rPr>
-                <w:rFonts w:ascii="Arial" w:hAnsi="Arial" w:cs="Arial"/>
+                <w:rFonts w:ascii="Calibri" w:hAnsi="Calibri" w:cs="Calibri"/>
                 <w:sz w:val="20"/>
                 <w:szCs w:val="20"/>
               </w:rPr>
             </w:pPr>
             <w:r>
               <w:rPr>
-                <w:rFonts w:ascii="Arial" w:hAnsi="Arial" w:cs="Arial"/>
+                <w:rFonts w:ascii="Calibri" w:hAnsi="Calibri" w:cs="Calibri"/>
                 <w:sz w:val="20"/>
                 <w:szCs w:val="20"/>
               </w:rPr>
@@ -1245,7 +1433,7 @@
             <w:proofErr w:type="gramStart"/>
             <w:r>
               <w:rPr>
-                <w:rFonts w:ascii="Arial" w:hAnsi="Arial" w:cs="Arial"/>
+                <w:rFonts w:ascii="Calibri" w:hAnsi="Calibri" w:cs="Calibri"/>
                 <w:sz w:val="20"/>
                 <w:szCs w:val="20"/>
               </w:rPr>
@@ -1254,7 +1442,7 @@
             <w:proofErr w:type="gramEnd"/>
             <w:r>
               <w:rPr>
-                <w:rFonts w:ascii="Arial" w:hAnsi="Arial" w:cs="Arial"/>
+                <w:rFonts w:ascii="Calibri" w:hAnsi="Calibri" w:cs="Calibri"/>
                 <w:sz w:val="20"/>
                 <w:szCs w:val="20"/>
               </w:rPr>
@@ -1263,7 +1451,7 @@
             <w:proofErr w:type="spellEnd"/>
             <w:r>
               <w:rPr>
-                <w:rFonts w:ascii="Arial" w:hAnsi="Arial" w:cs="Arial"/>
+                <w:rFonts w:ascii="Calibri" w:hAnsi="Calibri" w:cs="Calibri"/>
                 <w:sz w:val="20"/>
                 <w:szCs w:val="20"/>
               </w:rPr>
@@ -1271,7 +1459,7 @@
             </w:r>
             <w:r>
               <w:rPr>
-                <w:rFonts w:ascii="Arial" w:hAnsi="Arial" w:cs="Arial"/>
+                <w:rFonts w:ascii="Calibri" w:hAnsi="Calibri" w:cs="Calibri"/>
                 <w:sz w:val="20"/>
                 <w:szCs w:val="20"/>
               </w:rPr>
@@ -1281,7 +1469,7 @@
             <w:proofErr w:type="gramStart"/>
             <w:r>
               <w:rPr>
-                <w:rFonts w:ascii="Arial" w:hAnsi="Arial" w:cs="Arial"/>
+                <w:rFonts w:ascii="Calibri" w:hAnsi="Calibri" w:cs="Calibri"/>
                 <w:sz w:val="20"/>
                 <w:szCs w:val="20"/>
               </w:rPr>
@@ -1291,7 +1479,7 @@
             <w:proofErr w:type="gramEnd"/>
             <w:r>
               <w:rPr>
-                <w:rFonts w:ascii="Arial" w:hAnsi="Arial" w:cs="Arial"/>
+                <w:rFonts w:ascii="Calibri" w:hAnsi="Calibri" w:cs="Calibri"/>
                 <w:sz w:val="20"/>
                 <w:szCs w:val="20"/>
               </w:rPr>
@@ -1303,14 +1491,14 @@
               <w:keepLines/>
               <w:jc w:val="both"/>
               <w:rPr>
-                <w:rFonts w:ascii="Arial" w:hAnsi="Arial" w:cs="Arial"/>
+                <w:rFonts w:ascii="Calibri" w:hAnsi="Calibri" w:cs="Calibri"/>
                 <w:sz w:val="20"/>
                 <w:szCs w:val="20"/>
               </w:rPr>
             </w:pPr>
             <w:r>
               <w:rPr>
-                <w:rFonts w:ascii="Arial" w:hAnsi="Arial" w:cs="Arial"/>
+                <w:rFonts w:ascii="Calibri" w:hAnsi="Calibri" w:cs="Calibri"/>
                 <w:sz w:val="20"/>
                 <w:szCs w:val="20"/>
               </w:rPr>
@@ -1320,7 +1508,7 @@
             <w:proofErr w:type="gramStart"/>
             <w:r>
               <w:rPr>
-                <w:rFonts w:ascii="Arial" w:hAnsi="Arial" w:cs="Arial"/>
+                <w:rFonts w:ascii="Calibri" w:hAnsi="Calibri" w:cs="Calibri"/>
                 <w:sz w:val="20"/>
                 <w:szCs w:val="20"/>
               </w:rPr>
@@ -1328,7 +1516,7 @@
             </w:r>
             <w:r>
               <w:rPr>
-                <w:rFonts w:ascii="Arial" w:hAnsi="Arial" w:cs="Arial"/>
+                <w:rFonts w:ascii="Calibri" w:hAnsi="Calibri" w:cs="Calibri"/>
                 <w:sz w:val="20"/>
                 <w:szCs w:val="20"/>
               </w:rPr>
@@ -1337,7 +1525,7 @@
             <w:proofErr w:type="gramEnd"/>
             <w:r>
               <w:rPr>
-                <w:rFonts w:ascii="Arial" w:hAnsi="Arial" w:cs="Arial"/>
+                <w:rFonts w:ascii="Calibri" w:hAnsi="Calibri" w:cs="Calibri"/>
                 <w:sz w:val="20"/>
                 <w:szCs w:val="20"/>
               </w:rPr>
@@ -1346,7 +1534,7 @@
             <w:proofErr w:type="spellEnd"/>
             <w:r>
               <w:rPr>
-                <w:rFonts w:ascii="Arial" w:hAnsi="Arial" w:cs="Arial"/>
+                <w:rFonts w:ascii="Calibri" w:hAnsi="Calibri" w:cs="Calibri"/>
                 <w:sz w:val="20"/>
                 <w:szCs w:val="20"/>
               </w:rPr>
@@ -1363,14 +1551,14 @@
               <w:keepLines/>
               <w:jc w:val="center"/>
               <w:rPr>
-                <w:rFonts w:ascii="Arial" w:hAnsi="Arial" w:cs="Arial"/>
+                <w:rFonts w:ascii="Calibri" w:hAnsi="Calibri" w:cs="Calibri"/>
                 <w:sz w:val="20"/>
                 <w:szCs w:val="20"/>
               </w:rPr>
             </w:pPr>
             <w:r>
               <w:rPr>
-                <w:rFonts w:ascii="Arial" w:hAnsi="Arial" w:cs="Arial"/>
+                <w:rFonts w:ascii="Calibri" w:hAnsi="Calibri" w:cs="Calibri"/>
                 <w:sz w:val="20"/>
                 <w:szCs w:val="20"/>
               </w:rPr>
@@ -1380,7 +1568,7 @@
             <w:proofErr w:type="gramStart"/>
             <w:r>
               <w:rPr>
-                <w:rFonts w:ascii="Arial" w:hAnsi="Arial" w:cs="Arial"/>
+                <w:rFonts w:ascii="Calibri" w:hAnsi="Calibri" w:cs="Calibri"/>
                 <w:sz w:val="20"/>
                 <w:szCs w:val="20"/>
               </w:rPr>
@@ -1388,7 +1576,7 @@
             </w:r>
             <w:r>
               <w:rPr>
-                <w:rFonts w:ascii="Arial" w:hAnsi="Arial" w:cs="Arial"/>
+                <w:rFonts w:ascii="Calibri" w:hAnsi="Calibri" w:cs="Calibri"/>
                 <w:sz w:val="20"/>
                 <w:szCs w:val="20"/>
               </w:rPr>
@@ -1397,7 +1585,7 @@
             <w:proofErr w:type="gramEnd"/>
             <w:r>
               <w:rPr>
-                <w:rFonts w:ascii="Arial" w:hAnsi="Arial" w:cs="Arial"/>
+                <w:rFonts w:ascii="Calibri" w:hAnsi="Calibri" w:cs="Calibri"/>
                 <w:sz w:val="20"/>
                 <w:szCs w:val="20"/>
               </w:rPr>
@@ -1406,7 +1594,7 @@
             <w:proofErr w:type="spellEnd"/>
             <w:r>
               <w:rPr>
-                <w:rFonts w:ascii="Arial" w:hAnsi="Arial" w:cs="Arial"/>
+                <w:rFonts w:ascii="Calibri" w:hAnsi="Calibri" w:cs="Calibri"/>
                 <w:sz w:val="20"/>
                 <w:szCs w:val="20"/>
               </w:rPr>
@@ -1423,14 +1611,14 @@
               <w:keepLines/>
               <w:jc w:val="both"/>
               <w:rPr>
-                <w:rFonts w:ascii="Arial" w:hAnsi="Arial" w:cs="Arial"/>
+                <w:rFonts w:ascii="Calibri" w:hAnsi="Calibri" w:cs="Calibri"/>
                 <w:sz w:val="20"/>
                 <w:szCs w:val="20"/>
               </w:rPr>
             </w:pPr>
             <w:r>
               <w:rPr>
-                <w:rFonts w:ascii="Arial" w:hAnsi="Arial" w:cs="Arial"/>
+                <w:rFonts w:ascii="Calibri" w:hAnsi="Calibri" w:cs="Calibri"/>
                 <w:sz w:val="20"/>
                 <w:szCs w:val="20"/>
               </w:rPr>
@@ -1440,7 +1628,7 @@
             <w:proofErr w:type="gramStart"/>
             <w:r>
               <w:rPr>
-                <w:rFonts w:ascii="Arial" w:hAnsi="Arial" w:cs="Arial"/>
+                <w:rFonts w:ascii="Calibri" w:hAnsi="Calibri" w:cs="Calibri"/>
                 <w:sz w:val="20"/>
                 <w:szCs w:val="20"/>
               </w:rPr>
@@ -1448,7 +1636,7 @@
             </w:r>
             <w:r>
               <w:rPr>
-                <w:rFonts w:ascii="Arial" w:hAnsi="Arial" w:cs="Arial"/>
+                <w:rFonts w:ascii="Calibri" w:hAnsi="Calibri" w:cs="Calibri"/>
                 <w:sz w:val="20"/>
                 <w:szCs w:val="20"/>
               </w:rPr>
@@ -1457,7 +1645,7 @@
             <w:proofErr w:type="gramEnd"/>
             <w:r>
               <w:rPr>
-                <w:rFonts w:ascii="Arial" w:hAnsi="Arial" w:cs="Arial"/>
+                <w:rFonts w:ascii="Calibri" w:hAnsi="Calibri" w:cs="Calibri"/>
                 <w:sz w:val="20"/>
                 <w:szCs w:val="20"/>
               </w:rPr>
@@ -1466,7 +1654,7 @@
             <w:proofErr w:type="spellEnd"/>
             <w:r>
               <w:rPr>
-                <w:rFonts w:ascii="Arial" w:hAnsi="Arial" w:cs="Arial"/>
+                <w:rFonts w:ascii="Calibri" w:hAnsi="Calibri" w:cs="Calibri"/>
                 <w:sz w:val="20"/>
                 <w:szCs w:val="20"/>
               </w:rPr>
@@ -1481,14 +1669,14 @@
         <w:keepLines/>
         <w:jc w:val="both"/>
         <w:rPr>
-          <w:rFonts w:ascii="Arial" w:hAnsi="Arial" w:cs="Arial"/>
-          <w:sz w:val="22"/>
-          <w:szCs w:val="22"/>
-        </w:rPr>
-      </w:pPr>
-      <w:r>
-        <w:rPr>
-          <w:rFonts w:ascii="Arial" w:hAnsi="Arial" w:cs="Arial"/>
+          <w:rFonts w:ascii="Calibri" w:hAnsi="Calibri" w:cs="Calibri"/>
+          <w:sz w:val="22"/>
+          <w:szCs w:val="22"/>
+        </w:rPr>
+      </w:pPr>
+      <w:r>
+        <w:rPr>
+          <w:rFonts w:ascii="Calibri" w:hAnsi="Calibri" w:cs="Calibri"/>
           <w:sz w:val="22"/>
           <w:szCs w:val="22"/>
         </w:rPr>
@@ -1496,7 +1684,7 @@
       </w:r>
       <w:r>
         <w:rPr>
-          <w:rFonts w:ascii="Arial" w:hAnsi="Arial" w:cs="Arial"/>
+          <w:rFonts w:ascii="Calibri" w:hAnsi="Calibri" w:cs="Calibri"/>
           <w:sz w:val="22"/>
           <w:szCs w:val="22"/>
         </w:rPr>
@@ -1507,19 +1695,22 @@
       <w:pPr>
         <w:ind w:left="284"/>
         <w:jc w:val="both"/>
-        <w:rPr>
-          <w:rFonts w:ascii="Arial" w:hAnsi="Arial" w:cs="Arial"/>
-          <w:sz w:val="22"/>
-          <w:szCs w:val="22"/>
-        </w:rPr>
-      </w:pPr>
+      </w:pPr>
+      <w:r>
+        <w:rPr>
+          <w:rFonts w:ascii="Calibri" w:hAnsi="Calibri" w:cs="Calibri"/>
+          <w:sz w:val="22"/>
+          <w:szCs w:val="22"/>
+        </w:rPr>
+        <w:t xml:space="preserve">{%p endif %}</w:t>
+      </w:r>
     </w:p>
     <w:p>
       <w:pPr>
         <w:ind w:left="284"/>
         <w:jc w:val="both"/>
         <w:rPr>
-          <w:rFonts w:ascii="Arial" w:hAnsi="Arial" w:cs="Arial"/>
+          <w:rFonts w:ascii="Calibri" w:hAnsi="Calibri" w:cs="Calibri"/>
           <w:sz w:val="22"/>
           <w:szCs w:val="22"/>
         </w:rPr>
@@ -1530,7 +1721,7 @@
         <w:ind w:left="284"/>
         <w:jc w:val="both"/>
         <w:rPr>
-          <w:rFonts w:ascii="Arial" w:hAnsi="Arial" w:cs="Arial"/>
+          <w:rFonts w:ascii="Calibri" w:hAnsi="Calibri" w:cs="Calibri"/>
           <w:sz w:val="22"/>
           <w:szCs w:val="22"/>
         </w:rPr>
@@ -1541,7 +1732,7 @@
         <w:ind w:left="284"/>
         <w:jc w:val="both"/>
         <w:rPr>
-          <w:rFonts w:ascii="Arial" w:hAnsi="Arial" w:cs="Arial"/>
+          <w:rFonts w:ascii="Calibri" w:hAnsi="Calibri" w:cs="Calibri"/>
           <w:sz w:val="22"/>
           <w:szCs w:val="22"/>
         </w:rPr>
@@ -1552,7 +1743,7 @@
         <w:ind w:left="284"/>
         <w:jc w:val="both"/>
         <w:rPr>
-          <w:rFonts w:ascii="Arial" w:hAnsi="Arial" w:cs="Arial"/>
+          <w:rFonts w:ascii="Calibri" w:hAnsi="Calibri" w:cs="Calibri"/>
           <w:sz w:val="22"/>
           <w:szCs w:val="22"/>
         </w:rPr>
@@ -1563,7 +1754,7 @@
         <w:ind w:left="284"/>
         <w:jc w:val="both"/>
         <w:rPr>
-          <w:rFonts w:ascii="Arial" w:hAnsi="Arial" w:cs="Arial"/>
+          <w:rFonts w:ascii="Calibri" w:hAnsi="Calibri" w:cs="Calibri"/>
           <w:sz w:val="22"/>
           <w:szCs w:val="22"/>
         </w:rPr>
@@ -1574,7 +1765,7 @@
         <w:ind w:left="284"/>
         <w:jc w:val="both"/>
         <w:rPr>
-          <w:rFonts w:ascii="Arial" w:hAnsi="Arial" w:cs="Arial"/>
+          <w:rFonts w:ascii="Calibri" w:hAnsi="Calibri" w:cs="Calibri"/>
           <w:sz w:val="22"/>
           <w:szCs w:val="22"/>
         </w:rPr>
@@ -1585,7 +1776,7 @@
         <w:ind w:left="284"/>
         <w:jc w:val="both"/>
         <w:rPr>
-          <w:rFonts w:ascii="Arial" w:hAnsi="Arial" w:cs="Arial"/>
+          <w:rFonts w:ascii="Calibri" w:hAnsi="Calibri" w:cs="Calibri"/>
           <w:sz w:val="22"/>
           <w:szCs w:val="22"/>
         </w:rPr>
@@ -1596,7 +1787,7 @@
         <w:ind w:left="284"/>
         <w:jc w:val="both"/>
         <w:rPr>
-          <w:rFonts w:ascii="Arial" w:hAnsi="Arial" w:cs="Arial"/>
+          <w:rFonts w:ascii="Calibri" w:hAnsi="Calibri" w:cs="Calibri"/>
           <w:sz w:val="22"/>
           <w:szCs w:val="22"/>
         </w:rPr>
@@ -1607,7 +1798,7 @@
         <w:ind w:left="284"/>
         <w:jc w:val="both"/>
         <w:rPr>
-          <w:rFonts w:ascii="Arial" w:hAnsi="Arial" w:cs="Arial"/>
+          <w:rFonts w:ascii="Calibri" w:hAnsi="Calibri" w:cs="Calibri"/>
           <w:sz w:val="22"/>
           <w:szCs w:val="22"/>
         </w:rPr>
@@ -1618,7 +1809,7 @@
         <w:ind w:left="284"/>
         <w:jc w:val="both"/>
         <w:rPr>
-          <w:rFonts w:ascii="Arial" w:hAnsi="Arial" w:cs="Arial"/>
+          <w:rFonts w:ascii="Calibri" w:hAnsi="Calibri" w:cs="Calibri"/>
           <w:sz w:val="22"/>
           <w:szCs w:val="22"/>
         </w:rPr>
@@ -1629,7 +1820,7 @@
         <w:ind w:left="284"/>
         <w:jc w:val="both"/>
         <w:rPr>
-          <w:rFonts w:ascii="Arial" w:hAnsi="Arial" w:cs="Arial"/>
+          <w:rFonts w:ascii="Calibri" w:hAnsi="Calibri" w:cs="Calibri"/>
           <w:sz w:val="22"/>
           <w:szCs w:val="22"/>
         </w:rPr>
@@ -1640,7 +1831,7 @@
         <w:ind w:left="284"/>
         <w:jc w:val="both"/>
         <w:rPr>
-          <w:rFonts w:ascii="Arial" w:hAnsi="Arial" w:cs="Arial"/>
+          <w:rFonts w:ascii="Calibri" w:hAnsi="Calibri" w:cs="Calibri"/>
           <w:sz w:val="22"/>
           <w:szCs w:val="22"/>
         </w:rPr>
@@ -1651,7 +1842,7 @@
         <w:ind w:left="284"/>
         <w:jc w:val="both"/>
         <w:rPr>
-          <w:rFonts w:ascii="Arial" w:hAnsi="Arial" w:cs="Arial"/>
+          <w:rFonts w:ascii="Calibri" w:hAnsi="Calibri" w:cs="Calibri"/>
           <w:sz w:val="22"/>
           <w:szCs w:val="22"/>
         </w:rPr>
@@ -1662,7 +1853,7 @@
         <w:ind w:left="284"/>
         <w:jc w:val="both"/>
         <w:rPr>
-          <w:rFonts w:ascii="Arial" w:hAnsi="Arial" w:cs="Arial"/>
+          <w:rFonts w:ascii="Calibri" w:hAnsi="Calibri" w:cs="Calibri"/>
           <w:sz w:val="22"/>
           <w:szCs w:val="22"/>
         </w:rPr>
@@ -1673,7 +1864,7 @@
         <w:ind w:left="284"/>
         <w:jc w:val="both"/>
         <w:rPr>
-          <w:rFonts w:ascii="Arial" w:hAnsi="Arial" w:cs="Arial"/>
+          <w:rFonts w:ascii="Calibri" w:hAnsi="Calibri" w:cs="Calibri"/>
           <w:sz w:val="22"/>
           <w:szCs w:val="22"/>
         </w:rPr>
@@ -1684,7 +1875,7 @@
         <w:ind w:left="284"/>
         <w:jc w:val="both"/>
         <w:rPr>
-          <w:rFonts w:ascii="Arial" w:hAnsi="Arial" w:cs="Arial"/>
+          <w:rFonts w:ascii="Calibri" w:hAnsi="Calibri" w:cs="Calibri"/>
           <w:sz w:val="22"/>
           <w:szCs w:val="22"/>
         </w:rPr>
@@ -1695,7 +1886,7 @@
         <w:ind w:left="284"/>
         <w:jc w:val="both"/>
         <w:rPr>
-          <w:rFonts w:ascii="Arial" w:hAnsi="Arial" w:cs="Arial"/>
+          <w:rFonts w:ascii="Calibri" w:hAnsi="Calibri" w:cs="Calibri"/>
           <w:sz w:val="22"/>
           <w:szCs w:val="22"/>
         </w:rPr>
@@ -1706,7 +1897,18 @@
         <w:ind w:left="284"/>
         <w:jc w:val="both"/>
         <w:rPr>
-          <w:rFonts w:ascii="Arial" w:hAnsi="Arial" w:cs="Arial"/>
+          <w:rFonts w:ascii="Calibri" w:hAnsi="Calibri" w:cs="Calibri"/>
+          <w:sz w:val="22"/>
+          <w:szCs w:val="22"/>
+        </w:rPr>
+      </w:pPr>
+    </w:p>
+    <w:p>
+      <w:pPr>
+        <w:ind w:left="284"/>
+        <w:jc w:val="both"/>
+        <w:rPr>
+          <w:rFonts w:ascii="Calibri" w:hAnsi="Calibri" w:cs="Calibri"/>
           <w:sz w:val="22"/>
           <w:szCs w:val="22"/>
         </w:rPr>

</xml_diff>